<commit_message>
Update blog post and remove old HTML version
</commit_message>
<xml_diff>
--- a/blog/content/20260702-人生海海.docx
+++ b/blog/content/20260702-人生海海.docx
@@ -169,7 +169,67 @@
           <w:rFonts w:hint="eastAsia"/>
           <w:lang w:val="en-US" w:eastAsia="zh-CN"/>
         </w:rPr>
-        <w:t>现实中选取第一种策略的人居多，但是历史和现实都告诉我们，最后在各自领域成为执牛耳者的，往往并不是出身即巅峰的人。这是因为出身很好的人</w:t>
+        <w:t>现实中选取第一种策略的人居多，但是历史和现实都告诉我们，最后在各自领域成为执牛耳者的，往往并不是出身即巅峰的人。这是因为出身很好的人选择了局部最优，而局部最优不代表全局最优。</w:t>
+      </w:r>
+    </w:p>
+    <w:p>
+      <w:pPr>
+        <w:keepNext w:val="0"/>
+        <w:keepLines w:val="0"/>
+        <w:pageBreakBefore w:val="0"/>
+        <w:widowControl w:val="0"/>
+        <w:kinsoku/>
+        <w:wordWrap/>
+        <w:overflowPunct/>
+        <w:topLinePunct w:val="0"/>
+        <w:autoSpaceDE/>
+        <w:autoSpaceDN/>
+        <w:bidi w:val="0"/>
+        <w:adjustRightInd/>
+        <w:snapToGrid/>
+        <w:ind w:firstLine="420" w:firstLineChars="200"/>
+        <w:textAlignment w:val="auto"/>
+        <w:rPr>
+          <w:rFonts w:hint="eastAsia"/>
+          <w:lang w:val="en-US" w:eastAsia="zh-CN"/>
+        </w:rPr>
+      </w:pPr>
+      <w:r>
+        <w:rPr>
+          <w:rFonts w:hint="eastAsia"/>
+          <w:lang w:val="en-US" w:eastAsia="zh-CN"/>
+        </w:rPr>
+        <w:t>在博弈论中有个名为“囚徒困境”的例子，假设警察抓到了两名嫌疑犯，其中一位是无辜的，但是基于目前的证据无法确认哪一个才是真正的犯人，因此警察规定，如果两个人都承认自己是犯人，那么都关一年，如果一个人承认自己是犯人，那么承认的那个人关十年，没有承认的人被释放，如果两个人都不承认自己是犯人，那么都关三年。站在其中一名嫌疑犯的视角上看的话，如果另一个人承认了自己的罪行，自己不承认的话便被释放，自己承认的话便被关一年，如果另一个人没有承认自己的罪行，自己不承认的话便被关三年，自己承认的话便被关十年，因此，从自己的利益出发，必然选择不承认是最优的，那么最终的结果一定是两个人都不承认，都被关三年。可是我们知道，如果两个人都承认的话，只用关一年即可，因此局部最优不一定就能得到全局最优。</w:t>
+      </w:r>
+    </w:p>
+    <w:p>
+      <w:pPr>
+        <w:keepNext w:val="0"/>
+        <w:keepLines w:val="0"/>
+        <w:pageBreakBefore w:val="0"/>
+        <w:widowControl w:val="0"/>
+        <w:kinsoku/>
+        <w:wordWrap/>
+        <w:overflowPunct/>
+        <w:topLinePunct w:val="0"/>
+        <w:autoSpaceDE/>
+        <w:autoSpaceDN/>
+        <w:bidi w:val="0"/>
+        <w:adjustRightInd/>
+        <w:snapToGrid/>
+        <w:ind w:firstLine="420" w:firstLineChars="200"/>
+        <w:textAlignment w:val="auto"/>
+        <w:rPr>
+          <w:rFonts w:hint="default"/>
+          <w:lang w:val="en-US" w:eastAsia="zh-CN"/>
+        </w:rPr>
+      </w:pPr>
+      <w:r>
+        <w:rPr>
+          <w:rFonts w:hint="eastAsia"/>
+          <w:lang w:val="en-US" w:eastAsia="zh-CN"/>
+        </w:rPr>
+        <w:t>在生活和工作中，我们每人都试图去寻找人生的全局最优解，那么眼前吃点亏，其实也是没什么大不了的，毕竟，局域最优不代表全局最优。就像</w:t>
       </w:r>
       <w:bookmarkStart w:id="0" w:name="_GoBack"/>
       <w:bookmarkEnd w:id="0"/>
@@ -178,67 +238,7 @@
           <w:rFonts w:hint="eastAsia"/>
           <w:lang w:val="en-US" w:eastAsia="zh-CN"/>
         </w:rPr>
-        <w:t>选择了局部最优，而局部最优不代表全局最优。</w:t>
-      </w:r>
-    </w:p>
-    <w:p>
-      <w:pPr>
-        <w:keepNext w:val="0"/>
-        <w:keepLines w:val="0"/>
-        <w:pageBreakBefore w:val="0"/>
-        <w:widowControl w:val="0"/>
-        <w:kinsoku/>
-        <w:wordWrap/>
-        <w:overflowPunct/>
-        <w:topLinePunct w:val="0"/>
-        <w:autoSpaceDE/>
-        <w:autoSpaceDN/>
-        <w:bidi w:val="0"/>
-        <w:adjustRightInd/>
-        <w:snapToGrid/>
-        <w:ind w:firstLine="420" w:firstLineChars="200"/>
-        <w:textAlignment w:val="auto"/>
-        <w:rPr>
-          <w:rFonts w:hint="eastAsia"/>
-          <w:lang w:val="en-US" w:eastAsia="zh-CN"/>
-        </w:rPr>
-      </w:pPr>
-      <w:r>
-        <w:rPr>
-          <w:rFonts w:hint="eastAsia"/>
-          <w:lang w:val="en-US" w:eastAsia="zh-CN"/>
-        </w:rPr>
-        <w:t>在博弈论中有个名为“囚徒困境”的例子，假设警察抓到了两名嫌疑犯，其中一位是无辜的，但是基于目前的证据无法确认哪一个才是真正的犯人，因此警察规定，如果两个人都承认自己是犯人，那么都关一年，如果一个人承认自己是犯人，那么承认的那个人关十年，没有承认的人被释放，如果两个人都不承认自己是犯人，那么都关三年。站在其中一名嫌疑犯的视角上看的话，如果另一个人承认了自己的罪行，自己不承认的话便被释放，自己承认的话便被关一年，如果另一个人没有承认自己的罪行，自己不承认的话便被关三年，自己承认的话便被关十年，因此，从自己的利益出发，必然选择不承认是最优的，那么最终的结果一定是两个人都不承认，都被关三年。可是我们知道，如果两个人都承认的话，只用关一年即可，因此局部最优不一定就能得到全局最优。</w:t>
-      </w:r>
-    </w:p>
-    <w:p>
-      <w:pPr>
-        <w:keepNext w:val="0"/>
-        <w:keepLines w:val="0"/>
-        <w:pageBreakBefore w:val="0"/>
-        <w:widowControl w:val="0"/>
-        <w:kinsoku/>
-        <w:wordWrap/>
-        <w:overflowPunct/>
-        <w:topLinePunct w:val="0"/>
-        <w:autoSpaceDE/>
-        <w:autoSpaceDN/>
-        <w:bidi w:val="0"/>
-        <w:adjustRightInd/>
-        <w:snapToGrid/>
-        <w:ind w:firstLine="420" w:firstLineChars="200"/>
-        <w:textAlignment w:val="auto"/>
-        <w:rPr>
-          <w:rFonts w:hint="default"/>
-          <w:lang w:val="en-US" w:eastAsia="zh-CN"/>
-        </w:rPr>
-      </w:pPr>
-      <w:r>
-        <w:rPr>
-          <w:rFonts w:hint="eastAsia"/>
-          <w:lang w:val="en-US" w:eastAsia="zh-CN"/>
-        </w:rPr>
-        <w:t>在生活和工作中，我们每人都试图去寻找人生的全局最优解，那么眼前吃点亏，其实也是没什么大不了的，毕竟，局域最优不代表全局最优。用五月天在《人生海海》里唱的那样：</w:t>
+        <w:t>五月天在《人生海海》里唱的那样：</w:t>
       </w:r>
     </w:p>
     <w:p>

</xml_diff>